<commit_message>
QA pass on the MIPA reply package before it goes out
Two corrections from cross-checking every claim against the actual
agreement text: (1) the closing-date item overstated the risk - the
redline already carries a "no earlier than 36 months after CMS
Certification" floor, so the ask is reframed around the real residual
issue (the Jan 8-15 window where the fixed $258,489.46 final payment
no longer matches its computation date); (2) the Palmetto reactivation
letter date conflicted across sources (3/20/26 in the original redline
comment vs 3/23/2026 in the seller-provided documents) - outbound
email and the new reply comment now say "March 2026" pending
verification against the letter itself. Geoff's original comment 22
left untouched since Bender already reviewed it.
</commit_message>
<xml_diff>
--- a/sba_application/17_mipa_negotiation_2026-07-22/Email to Blaise Bender - MIPA Response DRAFT.docx
+++ b/sba_application/17_mipa_negotiation_2026-07-22/Email to Blaise Bender - MIPA Response DRAFT.docx
@@ -119,7 +119,7 @@
         <w:rPr>
           <w:sz w:val="22"/>
         </w:rPr>
-        <w:t>Closing date. “On or about” reopens the exact timing risk the January 15, 2027 date was meant to close off. A closing even a few days early falls back inside the 36 month window under 42 CFR §424.550(b), and the current enrollment moratorium makes that worse, not better. I'd rather have a hard floor: “not before January 15, 2027.” Let me know if there's a reason you need the flexibility to close earlier.</w:t>
+        <w:t>Closing date. I see the “no earlier than thirty-six (36) months after the Company's CMS Certification” qualifier stays in, which protects the regulatory floor, so we're aligned on the substance. The remaining wrinkle is that “on or about January 15” leaves a window between January 8 and January 15 where the final payment figure of $258,489.46 no longer matches, since that number is computed to January 15 exactly. Simplest fix is “not before January 15, 2027.” If you want the flexibility to close in that one week window instead, the final payment needs to be restated as a formula rather than a fixed number. Either works for me, just pick one.</w:t>
       </w:r>
     </w:p>
     <w:p>
@@ -172,7 +172,7 @@
         <w:rPr>
           <w:sz w:val="22"/>
         </w:rPr>
-        <w:t>Section 1.09, Payment Deferral for Regulatory Payment Events. Gives me the ability to defer a payment if Medicare payment is delayed by a provisional period of enhanced oversight, prepayment review, or additional documentation requests. Capped at 12 months total, interest keeps accruing, no default triggered. Given Palmetto's 3/20/26 reactivation letter, this is a real risk, not a hypothetical one.</w:t>
+        <w:t>Section 1.09, Payment Deferral for Regulatory Payment Events. Gives me the ability to defer a payment if Medicare payment is delayed by a provisional period of enhanced oversight, prepayment review, or additional documentation requests. Capped at 12 months total, interest keeps accruing, no default triggered. Given Palmetto's March 2026 reactivation letter, this is a real risk, not a hypothetical one.</w:t>
       </w:r>
     </w:p>
     <w:p>

</xml_diff>